<commit_message>
README: teammate download guide + per-section instructions
</commit_message>
<xml_diff>
--- a/outputs/CPE415_README.docx
+++ b/outputs/CPE415_README.docx
@@ -30,18 +30,7 @@
         <w:rPr>
           <w:i/>
         </w:rPr>
-        <w:t>**Federal University of Technology Akure (FUTA) — Department of Electrical &amp; Electronics Engineering**</w:t>
-      </w:r>
-    </w:p>
-    <w:p>
-      <w:pPr>
-        <w:ind w:left="432"/>
-      </w:pPr>
-      <w:r>
-        <w:rPr>
-          <w:i/>
-        </w:rPr>
-        <w:t>Mathematical Modelling Course Project, Session 2025/2026</w:t>
+        <w:t>**FUTA — Department of Electrical &amp; Electronics Engineering · Mathematical Modelling Project · 2025/2026 Session**</w:t>
       </w:r>
     </w:p>
     <w:p>
@@ -53,6 +42,573 @@
           <w:i/>
         </w:rPr>
         <w:t>Submission deadline: **24 April 2026**</w:t>
+      </w:r>
+    </w:p>
+    <w:p>
+      <w:r>
+        <w:t>---</w:t>
+      </w:r>
+    </w:p>
+    <w:p>
+      <w:pPr>
+        <w:pStyle w:val="Heading2"/>
+      </w:pPr>
+      <w:r>
+        <w:t>📌 Hey group — start here</w:t>
+      </w:r>
+    </w:p>
+    <w:p>
+      <w:r>
+        <w:t xml:space="preserve">Below is a section-by-section table with </w:t>
+      </w:r>
+      <w:r>
+        <w:rPr>
+          <w:b/>
+        </w:rPr>
+        <w:t>exactly what to download for your assigned part</w:t>
+      </w:r>
+      <w:r>
+        <w:t>. Click the file, hit the download button on GitHub, open it in Word, and you're good. Everything has been pre-computed — the tables, the plots, the Methods section — you just need to write the surrounding narrative for your section and cite what's already here.</w:t>
+      </w:r>
+    </w:p>
+    <w:p>
+      <w:pPr>
+        <w:pStyle w:val="Heading3"/>
+      </w:pPr>
+      <w:r>
+        <w:t>📥 Where to download what</w:t>
+      </w:r>
+    </w:p>
+    <w:tbl>
+      <w:tblPr>
+        <w:tblStyle w:val="LightGrid-Accent1"/>
+        <w:tblW w:type="auto" w:w="0"/>
+        <w:tblLook w:firstColumn="1" w:firstRow="1" w:lastColumn="0" w:lastRow="0" w:noHBand="0" w:noVBand="1" w:val="04A0"/>
+      </w:tblPr>
+      <w:tblGrid>
+        <w:gridCol w:w="3120"/>
+        <w:gridCol w:w="3120"/>
+        <w:gridCol w:w="3120"/>
+      </w:tblGrid>
+      <w:tr>
+        <w:tc>
+          <w:tcPr>
+            <w:tcW w:type="dxa" w:w="3120"/>
+          </w:tcPr>
+          <w:p>
+            <w:r/>
+            <w:r>
+              <w:rPr>
+                <w:b/>
+              </w:rPr>
+              <w:t>Your section</w:t>
+            </w:r>
+          </w:p>
+        </w:tc>
+        <w:tc>
+          <w:tcPr>
+            <w:tcW w:type="dxa" w:w="3120"/>
+          </w:tcPr>
+          <w:p>
+            <w:r/>
+            <w:r>
+              <w:rPr>
+                <w:b/>
+              </w:rPr>
+              <w:t>Click to download</w:t>
+            </w:r>
+          </w:p>
+        </w:tc>
+        <w:tc>
+          <w:tcPr>
+            <w:tcW w:type="dxa" w:w="3120"/>
+          </w:tcPr>
+          <w:p>
+            <w:r/>
+            <w:r>
+              <w:rPr>
+                <w:b/>
+              </w:rPr>
+              <w:t>What's inside you can paste straight in</w:t>
+            </w:r>
+          </w:p>
+        </w:tc>
+      </w:tr>
+      <w:tr>
+        <w:tc>
+          <w:tcPr>
+            <w:tcW w:type="dxa" w:w="3120"/>
+          </w:tcPr>
+          <w:p>
+            <w:r/>
+            <w:r>
+              <w:rPr>
+                <w:b/>
+              </w:rPr>
+              <w:t>Introduction &amp; Literature Review</w:t>
+            </w:r>
+          </w:p>
+        </w:tc>
+        <w:tc>
+          <w:tcPr>
+            <w:tcW w:type="dxa" w:w="3120"/>
+          </w:tcPr>
+          <w:p>
+            <w:r/>
+            <w:r>
+              <w:t>[</w:t>
+            </w:r>
+            <w:r>
+              <w:rPr>
+                <w:rFonts w:ascii="Consolas" w:hAnsi="Consolas"/>
+                <w:color w:val="660099"/>
+                <w:sz w:val="20"/>
+              </w:rPr>
+              <w:t>README.md</w:t>
+            </w:r>
+            <w:r>
+              <w:t>](README.md) + [</w:t>
+            </w:r>
+            <w:r>
+              <w:rPr>
+                <w:rFonts w:ascii="Consolas" w:hAnsi="Consolas"/>
+                <w:color w:val="660099"/>
+                <w:sz w:val="20"/>
+              </w:rPr>
+              <w:t>outputs/report.md</w:t>
+            </w:r>
+            <w:r>
+              <w:t>](outputs/report.md)</w:t>
+            </w:r>
+          </w:p>
+        </w:tc>
+        <w:tc>
+          <w:tcPr>
+            <w:tcW w:type="dxa" w:w="3120"/>
+          </w:tcPr>
+          <w:p>
+            <w:r/>
+            <w:r>
+              <w:t xml:space="preserve">Problem statement, context, headline results summary. Use the Background/Motivation prompts in </w:t>
+            </w:r>
+            <w:r>
+              <w:rPr>
+                <w:i/>
+              </w:rPr>
+              <w:t>What this project is</w:t>
+            </w:r>
+            <w:r>
+              <w:t xml:space="preserve"> below, plus the citations listed in </w:t>
+            </w:r>
+            <w:r>
+              <w:rPr>
+                <w:rFonts w:ascii="Consolas" w:hAnsi="Consolas"/>
+                <w:color w:val="660099"/>
+                <w:sz w:val="20"/>
+              </w:rPr>
+              <w:t>METHODS.md</w:t>
+            </w:r>
+            <w:r>
+              <w:t>.</w:t>
+            </w:r>
+          </w:p>
+        </w:tc>
+      </w:tr>
+      <w:tr>
+        <w:tc>
+          <w:tcPr>
+            <w:tcW w:type="dxa" w:w="3120"/>
+          </w:tcPr>
+          <w:p>
+            <w:r/>
+            <w:r>
+              <w:rPr>
+                <w:b/>
+              </w:rPr>
+              <w:t>Methods (Section II)</w:t>
+            </w:r>
+          </w:p>
+        </w:tc>
+        <w:tc>
+          <w:tcPr>
+            <w:tcW w:type="dxa" w:w="3120"/>
+          </w:tcPr>
+          <w:p>
+            <w:r/>
+            <w:r>
+              <w:t>[</w:t>
+            </w:r>
+            <w:r>
+              <w:rPr>
+                <w:rFonts w:ascii="Consolas" w:hAnsi="Consolas"/>
+                <w:color w:val="660099"/>
+                <w:sz w:val="20"/>
+              </w:rPr>
+              <w:t>METHODS.md</w:t>
+            </w:r>
+            <w:r>
+              <w:t>](METHODS.md) · [</w:t>
+            </w:r>
+            <w:r>
+              <w:rPr>
+                <w:rFonts w:ascii="Consolas" w:hAnsi="Consolas"/>
+                <w:color w:val="660099"/>
+                <w:sz w:val="20"/>
+              </w:rPr>
+              <w:t>outputs/CPE415_Methods.docx</w:t>
+            </w:r>
+            <w:r>
+              <w:t>](outputs/CPE415_Methods.docx)</w:t>
+            </w:r>
+          </w:p>
+        </w:tc>
+        <w:tc>
+          <w:tcPr>
+            <w:tcW w:type="dxa" w:w="3120"/>
+          </w:tcPr>
+          <w:p>
+            <w:r/>
+            <w:r>
+              <w:t xml:space="preserve">✅ </w:t>
+            </w:r>
+            <w:r>
+              <w:rPr>
+                <w:b/>
+              </w:rPr>
+              <w:t>Already written.</w:t>
+            </w:r>
+            <w:r>
+              <w:t xml:space="preserve"> Open the .docx in Word, touch up formatting/figures, done.</w:t>
+            </w:r>
+          </w:p>
+        </w:tc>
+      </w:tr>
+      <w:tr>
+        <w:tc>
+          <w:tcPr>
+            <w:tcW w:type="dxa" w:w="3120"/>
+          </w:tcPr>
+          <w:p>
+            <w:r/>
+            <w:r>
+              <w:rPr>
+                <w:b/>
+              </w:rPr>
+              <w:t>Results &amp; Discussion (Section V)</w:t>
+            </w:r>
+          </w:p>
+        </w:tc>
+        <w:tc>
+          <w:tcPr>
+            <w:tcW w:type="dxa" w:w="3120"/>
+          </w:tcPr>
+          <w:p>
+            <w:r/>
+            <w:r>
+              <w:t>[</w:t>
+            </w:r>
+            <w:r>
+              <w:rPr>
+                <w:rFonts w:ascii="Consolas" w:hAnsi="Consolas"/>
+                <w:color w:val="660099"/>
+                <w:sz w:val="20"/>
+              </w:rPr>
+              <w:t>outputs/report.md</w:t>
+            </w:r>
+            <w:r>
+              <w:t>](outputs/report.md) · [</w:t>
+            </w:r>
+            <w:r>
+              <w:rPr>
+                <w:rFonts w:ascii="Consolas" w:hAnsi="Consolas"/>
+                <w:color w:val="660099"/>
+                <w:sz w:val="20"/>
+              </w:rPr>
+              <w:t>outputs/CPE415_Results.docx</w:t>
+            </w:r>
+            <w:r>
+              <w:t>](outputs/CPE415_Results.docx) · [</w:t>
+            </w:r>
+            <w:r>
+              <w:rPr>
+                <w:rFonts w:ascii="Consolas" w:hAnsi="Consolas"/>
+                <w:color w:val="660099"/>
+                <w:sz w:val="20"/>
+              </w:rPr>
+              <w:t>outputs/fit_results.csv</w:t>
+            </w:r>
+            <w:r>
+              <w:t>](outputs/fit_results.csv) · [</w:t>
+            </w:r>
+            <w:r>
+              <w:rPr>
+                <w:rFonts w:ascii="Consolas" w:hAnsi="Consolas"/>
+                <w:color w:val="660099"/>
+                <w:sz w:val="20"/>
+              </w:rPr>
+              <w:t>outputs/plots/</w:t>
+            </w:r>
+            <w:r>
+              <w:t>](outputs/plots)</w:t>
+            </w:r>
+          </w:p>
+        </w:tc>
+        <w:tc>
+          <w:tcPr>
+            <w:tcW w:type="dxa" w:w="3120"/>
+          </w:tcPr>
+          <w:p>
+            <w:r/>
+            <w:r>
+              <w:t xml:space="preserve">Every fitted distribution, every KS/AD/SW/AIC value, every best-fit verdict, the distance-regression output. Plots are in </w:t>
+            </w:r>
+            <w:r>
+              <w:rPr>
+                <w:rFonts w:ascii="Consolas" w:hAnsi="Consolas"/>
+                <w:color w:val="660099"/>
+                <w:sz w:val="20"/>
+              </w:rPr>
+              <w:t>outputs/plots/</w:t>
+            </w:r>
+            <w:r>
+              <w:t>.</w:t>
+            </w:r>
+          </w:p>
+        </w:tc>
+      </w:tr>
+      <w:tr>
+        <w:tc>
+          <w:tcPr>
+            <w:tcW w:type="dxa" w:w="3120"/>
+          </w:tcPr>
+          <w:p>
+            <w:r/>
+            <w:r>
+              <w:rPr>
+                <w:b/>
+              </w:rPr>
+              <w:t>Regulatory Compliance (Section VI)</w:t>
+            </w:r>
+          </w:p>
+        </w:tc>
+        <w:tc>
+          <w:tcPr>
+            <w:tcW w:type="dxa" w:w="3120"/>
+          </w:tcPr>
+          <w:p>
+            <w:r/>
+            <w:r>
+              <w:t>Key numbers below ⬇</w:t>
+            </w:r>
+          </w:p>
+        </w:tc>
+        <w:tc>
+          <w:tcPr>
+            <w:tcW w:type="dxa" w:w="3120"/>
+          </w:tcPr>
+          <w:p>
+            <w:r/>
+            <w:r>
+              <w:t xml:space="preserve">Our max RF = </w:t>
+            </w:r>
+            <w:r>
+              <w:rPr>
+                <w:b/>
+              </w:rPr>
+              <w:t>0.83 mW/m²</w:t>
+            </w:r>
+            <w:r>
+              <w:t xml:space="preserve">. ICNIRP public limit at 2–3 GHz = </w:t>
+            </w:r>
+            <w:r>
+              <w:rPr>
+                <w:b/>
+              </w:rPr>
+              <w:t>10 000 mW/m²</w:t>
+            </w:r>
+            <w:r>
+              <w:t xml:space="preserve">. Ratio = </w:t>
+            </w:r>
+            <w:r>
+              <w:rPr>
+                <w:b/>
+              </w:rPr>
+              <w:t>~12 000× below limit</w:t>
+            </w:r>
+            <w:r>
+              <w:t>. Cite ICNIRP 2020 Guidelines.</w:t>
+            </w:r>
+          </w:p>
+        </w:tc>
+      </w:tr>
+      <w:tr>
+        <w:tc>
+          <w:tcPr>
+            <w:tcW w:type="dxa" w:w="3120"/>
+          </w:tcPr>
+          <w:p>
+            <w:r/>
+            <w:r>
+              <w:rPr>
+                <w:b/>
+              </w:rPr>
+              <w:t>Conclusion (Section VII)</w:t>
+            </w:r>
+          </w:p>
+        </w:tc>
+        <w:tc>
+          <w:tcPr>
+            <w:tcW w:type="dxa" w:w="3120"/>
+          </w:tcPr>
+          <w:p>
+            <w:r/>
+            <w:r>
+              <w:t>[</w:t>
+            </w:r>
+            <w:r>
+              <w:rPr>
+                <w:rFonts w:ascii="Consolas" w:hAnsi="Consolas"/>
+                <w:color w:val="660099"/>
+                <w:sz w:val="20"/>
+              </w:rPr>
+              <w:t>outputs/report.md</w:t>
+            </w:r>
+            <w:r>
+              <w:t>](outputs/report.md)</w:t>
+            </w:r>
+          </w:p>
+        </w:tc>
+        <w:tc>
+          <w:tcPr>
+            <w:tcW w:type="dxa" w:w="3120"/>
+          </w:tcPr>
+          <w:p>
+            <w:r/>
+            <w:r>
+              <w:t>Summarise: Lognormal wins for RF (KS p = 0.977), magnetic-field quantisation issue, E-field below detection floor, safety compliant.</w:t>
+            </w:r>
+          </w:p>
+        </w:tc>
+      </w:tr>
+      <w:tr>
+        <w:tc>
+          <w:tcPr>
+            <w:tcW w:type="dxa" w:w="3120"/>
+          </w:tcPr>
+          <w:p>
+            <w:r/>
+            <w:r>
+              <w:rPr>
+                <w:b/>
+              </w:rPr>
+              <w:t>References / formatting</w:t>
+            </w:r>
+          </w:p>
+        </w:tc>
+        <w:tc>
+          <w:tcPr>
+            <w:tcW w:type="dxa" w:w="3120"/>
+          </w:tcPr>
+          <w:p>
+            <w:r/>
+            <w:r>
+              <w:t>[</w:t>
+            </w:r>
+            <w:r>
+              <w:rPr>
+                <w:rFonts w:ascii="Consolas" w:hAnsi="Consolas"/>
+                <w:color w:val="660099"/>
+                <w:sz w:val="20"/>
+              </w:rPr>
+              <w:t>METHODS.md</w:t>
+            </w:r>
+            <w:r>
+              <w:t>](METHODS.md)</w:t>
+            </w:r>
+          </w:p>
+        </w:tc>
+        <w:tc>
+          <w:tcPr>
+            <w:tcW w:type="dxa" w:w="3120"/>
+          </w:tcPr>
+          <w:p>
+            <w:r/>
+            <w:r>
+              <w:t>Numbered citations [1]–[10] already used in Methods — extend the same list.</w:t>
+            </w:r>
+          </w:p>
+        </w:tc>
+      </w:tr>
+    </w:tbl>
+    <w:p/>
+    <w:p>
+      <w:pPr>
+        <w:pStyle w:val="Heading3"/>
+      </w:pPr>
+      <w:r>
+        <w:t>🟢 Start here if you're new to the repo</w:t>
+      </w:r>
+    </w:p>
+    <w:p>
+      <w:pPr>
+        <w:pStyle w:val="ListNumber"/>
+      </w:pPr>
+      <w:r>
+        <w:t>Open [</w:t>
+      </w:r>
+      <w:r>
+        <w:rPr>
+          <w:rFonts w:ascii="Consolas" w:hAnsi="Consolas"/>
+          <w:color w:val="660099"/>
+          <w:sz w:val="20"/>
+        </w:rPr>
+        <w:t>METHODS.md</w:t>
+      </w:r>
+      <w:r>
+        <w:t>](METHODS.md) — read it top to bottom. That's the spine of the report.</w:t>
+      </w:r>
+    </w:p>
+    <w:p>
+      <w:pPr>
+        <w:pStyle w:val="ListNumber"/>
+      </w:pPr>
+      <w:r>
+        <w:t>Open [</w:t>
+      </w:r>
+      <w:r>
+        <w:rPr>
+          <w:rFonts w:ascii="Consolas" w:hAnsi="Consolas"/>
+          <w:color w:val="660099"/>
+          <w:sz w:val="20"/>
+        </w:rPr>
+        <w:t>outputs/report.md</w:t>
+      </w:r>
+      <w:r>
+        <w:t>](outputs/report.md) — that's what every fitted distribution looks like.</w:t>
+      </w:r>
+    </w:p>
+    <w:p>
+      <w:pPr>
+        <w:pStyle w:val="ListNumber"/>
+      </w:pPr>
+      <w:r>
+        <w:t>Browse [</w:t>
+      </w:r>
+      <w:r>
+        <w:rPr>
+          <w:rFonts w:ascii="Consolas" w:hAnsi="Consolas"/>
+          <w:color w:val="660099"/>
+          <w:sz w:val="20"/>
+        </w:rPr>
+        <w:t>outputs/plots/</w:t>
+      </w:r>
+      <w:r>
+        <w:t>](outputs/plots) — those are the figures for the Results section.</w:t>
+      </w:r>
+    </w:p>
+    <w:p>
+      <w:r>
+        <w:t>---</w:t>
       </w:r>
     </w:p>
     <w:p>
@@ -70,16 +626,16 @@
     </w:p>
     <w:p>
       <w:r>
-        <w:t xml:space="preserve">For CPE 415 we take those numbers and </w:t>
+        <w:t xml:space="preserve">For CPE 415 we took those numbers and </w:t>
       </w:r>
       <w:r>
         <w:rPr>
           <w:b/>
         </w:rPr>
-        <w:t>figure out which probability distribution describes them best</w:t>
+        <w:t>figured out which probability distribution describes them best</w:t>
       </w:r>
       <w:r>
-        <w:t xml:space="preserve"> — Normal, Lognormal, Gamma, Weibull, Rayleigh, Exponential, Nakagami. We fit each candidate with Maximum Likelihood, run standard goodness-of-fit tests (Kolmogorov–Smirnov, Anderson–Darling, Shapiro–Wilk), rank them by AIC, and pick a winner per variable. That winning distribution — with our fitted parameters plugged in — </w:t>
+        <w:t xml:space="preserve"> — Normal, Lognormal, Gamma, Weibull, Rayleigh, Exponential, Nakagami. We fitted each candidate with Maximum Likelihood, ran standard goodness-of-fit tests (Kolmogorov–Smirnov, Anderson–Darling, Shapiro–Wilk), ranked them by AIC, and picked a winner per variable. That winning distribution — with our fitted parameters plugged in — </w:t>
       </w:r>
       <w:r>
         <w:rPr>
@@ -103,27 +659,8 @@
       </w:r>
     </w:p>
     <w:p>
-      <w:pPr>
-        <w:pStyle w:val="Heading2"/>
-      </w:pPr>
       <w:r>
-        <w:t>Repository layout</w:t>
-      </w:r>
-    </w:p>
-    <w:p>
-      <w:r>
-        <w:t>``</w:t>
-      </w:r>
-      <w:r>
-        <w:rPr>
-          <w:rFonts w:ascii="Consolas" w:hAnsi="Consolas"/>
-          <w:color w:val="660099"/>
-          <w:sz w:val="20"/>
-        </w:rPr>
-        <w:t xml:space="preserve"> mts-415/ ├── field_measurements.csv       ← the single source of truth (49 valid + 15 obstacle rows) ├── analysis.py                  ← runs the full modelling pipeline ├── md_to_docx.py                ← converts the Markdown deliverables into .docx ├── METHODS.md                   ← Section II of the report (ready to paste) ├── README.md                    ← this file └── outputs/ ├── report.md                ← Results + distance regression + excluded variables ├── fit_results.csv          ← master table: every variable × every distribution × every test ├── CPE415_Methods.docx      ← generated Word file ├── CPE415_Results.docx      ← generated Word file └── plots/ ├── rf_pdfs.png, rf_qq_Lognormal.png   (and the rest per variable) └── ... </w:t>
-      </w:r>
-      <w:r>
-        <w:t>``</w:t>
+        <w:t>---</w:t>
       </w:r>
     </w:p>
     <w:p>
@@ -131,139 +668,7 @@
         <w:pStyle w:val="Heading2"/>
       </w:pPr>
       <w:r>
-        <w:t>How to run it</w:t>
-      </w:r>
-    </w:p>
-    <w:p>
-      <w:r>
-        <w:t>``</w:t>
-      </w:r>
-      <w:r>
-        <w:rPr>
-          <w:rFonts w:ascii="Consolas" w:hAnsi="Consolas"/>
-          <w:color w:val="660099"/>
-          <w:sz w:val="20"/>
-        </w:rPr>
-        <w:t xml:space="preserve">bash pip install numpy scipy pandas matplotlib python-docx python3 analysis.py          # re-fits distributions, regenerates tables + plots python3 md_to_docx.py         # converts METHODS.md, report.md, README.md → .docx </w:t>
-      </w:r>
-      <w:r>
-        <w:t>``</w:t>
-      </w:r>
-    </w:p>
-    <w:p>
-      <w:r>
-        <w:t xml:space="preserve">Everything regenerates from </w:t>
-      </w:r>
-      <w:r>
-        <w:rPr>
-          <w:rFonts w:ascii="Consolas" w:hAnsi="Consolas"/>
-          <w:color w:val="660099"/>
-          <w:sz w:val="20"/>
-        </w:rPr>
-        <w:t>field_measurements.csv</w:t>
-      </w:r>
-      <w:r>
-        <w:t xml:space="preserve"> in ~2 seconds. If anyone spots a transcription error in the raw data, edit the CSV and re-run — no hand-editing of tables.</w:t>
-      </w:r>
-    </w:p>
-    <w:p>
-      <w:pPr>
-        <w:pStyle w:val="Heading2"/>
-      </w:pPr>
-      <w:r>
-        <w:t>The data (one-line summary)</w:t>
-      </w:r>
-    </w:p>
-    <w:p>
-      <w:pPr>
-        <w:pStyle w:val="ListBullet"/>
-      </w:pPr>
-      <w:r>
-        <w:rPr>
-          <w:b/>
-        </w:rPr>
-        <w:t>Site:</w:t>
-      </w:r>
-      <w:r>
-        <w:t xml:space="preserve"> Bisi Balogun Postgraduate Hostel, FUTA (7°17′52″N, 5°8′46″E), 23 Sept 2025, 12:10 PM</w:t>
-      </w:r>
-    </w:p>
-    <w:p>
-      <w:pPr>
-        <w:pStyle w:val="ListBullet"/>
-      </w:pPr>
-      <w:r>
-        <w:rPr>
-          <w:b/>
-        </w:rPr>
-        <w:t>Mast:</w:t>
-      </w:r>
-      <w:r>
-        <w:t xml:space="preserve"> Lattice tower, MTN Nigeria, LTE Band 7 (2600 MHz), FDD</w:t>
-      </w:r>
-    </w:p>
-    <w:p>
-      <w:pPr>
-        <w:pStyle w:val="ListBullet"/>
-      </w:pPr>
-      <w:r>
-        <w:rPr>
-          <w:b/>
-        </w:rPr>
-        <w:t>Instrument:</w:t>
-      </w:r>
-      <w:r>
-        <w:t xml:space="preserve"> Trifield TF2 (E-field V/m, B-field mG, RF mW/m²)</w:t>
-      </w:r>
-    </w:p>
-    <w:p>
-      <w:pPr>
-        <w:pStyle w:val="ListBullet"/>
-      </w:pPr>
-      <w:r>
-        <w:rPr>
-          <w:b/>
-        </w:rPr>
-        <w:t>Grid:</w:t>
-      </w:r>
-      <w:r>
-        <w:t xml:space="preserve"> 8 radial distances (0, 5, 10, 20, 30, 50, 75, 100 ft) × 8 directions (N, NE, E, SE, S, SW, W, NW)</w:t>
-      </w:r>
-    </w:p>
-    <w:p>
-      <w:pPr>
-        <w:pStyle w:val="ListBullet"/>
-      </w:pPr>
-      <w:r>
-        <w:rPr>
-          <w:b/>
-        </w:rPr>
-        <w:t>Channels:</w:t>
-      </w:r>
-      <w:r>
-        <w:t xml:space="preserve"> 5 quantities × 2 (instantaneous + peak) = 10 numbers per grid point</w:t>
-      </w:r>
-    </w:p>
-    <w:p>
-      <w:pPr>
-        <w:pStyle w:val="ListBullet"/>
-      </w:pPr>
-      <w:r>
-        <w:rPr>
-          <w:b/>
-        </w:rPr>
-        <w:t>Valid readings:</w:t>
-      </w:r>
-      <w:r>
-        <w:t xml:space="preserve"> 49 (15 obstacle points excluded — tank at 20 ft SE, buildings NE/NW/SE/SW beyond 30 ft)</w:t>
-      </w:r>
-    </w:p>
-    <w:p>
-      <w:pPr>
-        <w:pStyle w:val="Heading2"/>
-      </w:pPr>
-      <w:r>
-        <w:t>Headline results</w:t>
+        <w:t>🎯 Headline results</w:t>
       </w:r>
     </w:p>
     <w:tbl>
@@ -813,13 +1218,7 @@
         <w:t>increases</w:t>
       </w:r>
       <w:r>
-        <w:t xml:space="preserve"> with distance from the mast (empirical exponent ≈ −0.36, R² = 0.69). This is not an error — it reflects the radiation pattern of downtilted sector antennas, which project energy outward rather than straight down. The base of the mast sits in a partial "RF shadow" zone. Our own measurement report notes this: </w:t>
-      </w:r>
-      <w:r>
-        <w:rPr>
-          <w:i/>
-        </w:rPr>
-        <w:t>"Standing directly under or near the mast still remains within compliance zones due to directional antennas focusing energy outward, not downward."</w:t>
+        <w:t xml:space="preserve"> with distance from the mast (empirical exponent ≈ −0.36, R² = 0.69). Not an error — reflects the radiation pattern of downtilted sector antennas, which project energy outward rather than straight down. The base of the mast sits in a partial "RF shadow" zone.</w:t>
       </w:r>
     </w:p>
     <w:p>
@@ -836,10 +1235,15 @@
         <w:rPr>
           <w:b/>
         </w:rPr>
-        <w:t>~12,000× below</w:t>
+        <w:t>~12 000× below</w:t>
       </w:r>
       <w:r>
         <w:t xml:space="preserve"> the ICNIRP public reference level of 10 W/m² at 2–3 GHz. No public-health concern at the measurement zone.</w:t>
+      </w:r>
+    </w:p>
+    <w:p>
+      <w:r>
+        <w:t>---</w:t>
       </w:r>
     </w:p>
     <w:p>
@@ -847,7 +1251,133 @@
         <w:pStyle w:val="Heading2"/>
       </w:pPr>
       <w:r>
-        <w:t>Who does what (group workflow)</w:t>
+        <w:t>📁 Repository layout</w:t>
+      </w:r>
+    </w:p>
+    <w:p>
+      <w:r>
+        <w:t>``</w:t>
+      </w:r>
+      <w:r>
+        <w:rPr>
+          <w:rFonts w:ascii="Consolas" w:hAnsi="Consolas"/>
+          <w:color w:val="660099"/>
+          <w:sz w:val="20"/>
+        </w:rPr>
+        <w:t xml:space="preserve"> mts-415/ ├── README.md                   ← this file (project overview, download guide) ├── METHODS.md                  ← Section II — Methodology (done) ├── analysis.py                 ← the Python pipeline (fits all distributions) ├── md_to_docx.py               ← converts .md → .docx for easy Word editing ├── field_measurements.csv      ← source of truth: 49 valid + 15 obstacle rows └── outputs/ ├── report.md               ← Results draft (all tables + verdicts) ├── fit_results.csv         ← master table: every (variable × distribution) × test stats ├── CPE415_Methods.docx     ← Methods in Word, ready to drop into the report ├── CPE415_Results.docx     ← Results in Word ├── CPE415_README.docx      ← this README in Word └── plots/ ├── rf_pdfs.png, rf_qq_Lognormal.png ├── rf_peak_pdfs.png, rf_peak_qq_Gamma.png ├── std_magnetic_*.png, wtd_magnetic_*.png, wtd_electric_peak_*.png └── (14 figures in total) </w:t>
+      </w:r>
+      <w:r>
+        <w:t>``</w:t>
+      </w:r>
+    </w:p>
+    <w:p>
+      <w:r>
+        <w:t>---</w:t>
+      </w:r>
+    </w:p>
+    <w:p>
+      <w:pPr>
+        <w:pStyle w:val="Heading2"/>
+      </w:pPr>
+      <w:r>
+        <w:t>The data (one-line summary)</w:t>
+      </w:r>
+    </w:p>
+    <w:p>
+      <w:pPr>
+        <w:pStyle w:val="ListBullet"/>
+      </w:pPr>
+      <w:r>
+        <w:rPr>
+          <w:b/>
+        </w:rPr>
+        <w:t>Site:</w:t>
+      </w:r>
+      <w:r>
+        <w:t xml:space="preserve"> Bisi Balogun Postgraduate Hostel, FUTA (7°17′52″N, 5°8′46″E), 23 Sept 2025, 12:10 PM</w:t>
+      </w:r>
+    </w:p>
+    <w:p>
+      <w:pPr>
+        <w:pStyle w:val="ListBullet"/>
+      </w:pPr>
+      <w:r>
+        <w:rPr>
+          <w:b/>
+        </w:rPr>
+        <w:t>Mast:</w:t>
+      </w:r>
+      <w:r>
+        <w:t xml:space="preserve"> Lattice tower, MTN Nigeria, LTE Band 7 (2600 MHz), FDD</w:t>
+      </w:r>
+    </w:p>
+    <w:p>
+      <w:pPr>
+        <w:pStyle w:val="ListBullet"/>
+      </w:pPr>
+      <w:r>
+        <w:rPr>
+          <w:b/>
+        </w:rPr>
+        <w:t>Instrument:</w:t>
+      </w:r>
+      <w:r>
+        <w:t xml:space="preserve"> Trifield TF2 (E-field V/m, B-field mG, RF mW/m²)</w:t>
+      </w:r>
+    </w:p>
+    <w:p>
+      <w:pPr>
+        <w:pStyle w:val="ListBullet"/>
+      </w:pPr>
+      <w:r>
+        <w:rPr>
+          <w:b/>
+        </w:rPr>
+        <w:t>Grid:</w:t>
+      </w:r>
+      <w:r>
+        <w:t xml:space="preserve"> 8 radial distances (0, 5, 10, 20, 30, 50, 75, 100 ft) × 8 directions (N, NE, E, SE, S, SW, W, NW)</w:t>
+      </w:r>
+    </w:p>
+    <w:p>
+      <w:pPr>
+        <w:pStyle w:val="ListBullet"/>
+      </w:pPr>
+      <w:r>
+        <w:rPr>
+          <w:b/>
+        </w:rPr>
+        <w:t>Channels:</w:t>
+      </w:r>
+      <w:r>
+        <w:t xml:space="preserve"> 5 quantities × 2 (instantaneous + peak) = 10 numbers per grid point</w:t>
+      </w:r>
+    </w:p>
+    <w:p>
+      <w:pPr>
+        <w:pStyle w:val="ListBullet"/>
+      </w:pPr>
+      <w:r>
+        <w:rPr>
+          <w:b/>
+        </w:rPr>
+        <w:t>Valid readings:</w:t>
+      </w:r>
+      <w:r>
+        <w:t xml:space="preserve"> 49 (15 obstacle points excluded — tank at 20 ft SE, buildings NE/NW/SE/SW beyond 30 ft)</w:t>
+      </w:r>
+    </w:p>
+    <w:p>
+      <w:r>
+        <w:t>---</w:t>
+      </w:r>
+    </w:p>
+    <w:p>
+      <w:pPr>
+        <w:pStyle w:val="Heading2"/>
+      </w:pPr>
+      <w:r>
+        <w:t>👥 Who does what</w:t>
       </w:r>
     </w:p>
     <w:tbl>
@@ -983,6 +1513,9 @@
           <w:p>
             <w:r/>
             <w:r>
+              <w:rPr>
+                <w:b/>
+              </w:rPr>
               <w:t>Methods (Section II)</w:t>
             </w:r>
           </w:p>
@@ -1005,7 +1538,7 @@
           <w:p>
             <w:r/>
             <w:r>
-              <w:t>✅ draft (</w:t>
+              <w:t xml:space="preserve">✅ done — </w:t>
             </w:r>
             <w:r>
               <w:rPr>
@@ -1016,7 +1549,15 @@
               <w:t>METHODS.md</w:t>
             </w:r>
             <w:r>
-              <w:t>)</w:t>
+              <w:t xml:space="preserve"> + </w:t>
+            </w:r>
+            <w:r>
+              <w:rPr>
+                <w:rFonts w:ascii="Consolas" w:hAnsi="Consolas"/>
+                <w:color w:val="660099"/>
+                <w:sz w:val="20"/>
+              </w:rPr>
+              <w:t>outputs/CPE415_Methods.docx</w:t>
             </w:r>
           </w:p>
         </w:tc>
@@ -1051,7 +1592,7 @@
           <w:p>
             <w:r/>
             <w:r>
-              <w:t xml:space="preserve">🟡 outline ready in </w:t>
+              <w:t xml:space="preserve">🟡 draft ready in </w:t>
             </w:r>
             <w:r>
               <w:rPr>
@@ -1207,11 +1748,85 @@
     </w:tbl>
     <w:p/>
     <w:p>
+      <w:r>
+        <w:rPr>
+          <w:b/>
+        </w:rPr>
+        <w:t>Claim a section in the group chat and update this table when you start.</w:t>
+      </w:r>
+    </w:p>
+    <w:p>
+      <w:r>
+        <w:t>---</w:t>
+      </w:r>
+    </w:p>
+    <w:p>
       <w:pPr>
         <w:pStyle w:val="Heading2"/>
       </w:pPr>
       <w:r>
-        <w:t>Submission plan</w:t>
+        <w:t>🔧 Reproducing the analysis locally (optional)</w:t>
+      </w:r>
+    </w:p>
+    <w:p>
+      <w:r>
+        <w:t xml:space="preserve">Only needed if you want to re-run the pipeline, change the CSV, or regenerate plots. If you're just writing — you don't need to run anything; the outputs are already in </w:t>
+      </w:r>
+      <w:r>
+        <w:rPr>
+          <w:rFonts w:ascii="Consolas" w:hAnsi="Consolas"/>
+          <w:color w:val="660099"/>
+          <w:sz w:val="20"/>
+        </w:rPr>
+        <w:t>outputs/</w:t>
+      </w:r>
+      <w:r>
+        <w:t>.</w:t>
+      </w:r>
+    </w:p>
+    <w:p>
+      <w:r>
+        <w:t>``</w:t>
+      </w:r>
+      <w:r>
+        <w:rPr>
+          <w:rFonts w:ascii="Consolas" w:hAnsi="Consolas"/>
+          <w:color w:val="660099"/>
+          <w:sz w:val="20"/>
+        </w:rPr>
+        <w:t xml:space="preserve">bash pip install numpy scipy pandas matplotlib python-docx python3 analysis.py       # fits distributions, regenerates outputs/report.md + plots python3 md_to_docx.py     # converts .md → .docx </w:t>
+      </w:r>
+      <w:r>
+        <w:t>``</w:t>
+      </w:r>
+    </w:p>
+    <w:p>
+      <w:r>
+        <w:t xml:space="preserve">Everything regenerates from </w:t>
+      </w:r>
+      <w:r>
+        <w:rPr>
+          <w:rFonts w:ascii="Consolas" w:hAnsi="Consolas"/>
+          <w:color w:val="660099"/>
+          <w:sz w:val="20"/>
+        </w:rPr>
+        <w:t>field_measurements.csv</w:t>
+      </w:r>
+      <w:r>
+        <w:t xml:space="preserve"> in ~2 seconds.</w:t>
+      </w:r>
+    </w:p>
+    <w:p>
+      <w:r>
+        <w:t>---</w:t>
+      </w:r>
+    </w:p>
+    <w:p>
+      <w:pPr>
+        <w:pStyle w:val="Heading2"/>
+      </w:pPr>
+      <w:r>
+        <w:t>📮 Submission plan</w:t>
       </w:r>
     </w:p>
     <w:p>
@@ -1244,7 +1859,7 @@
           <w:color w:val="660099"/>
           <w:sz w:val="20"/>
         </w:rPr>
-        <w:t>CPE415_Methods.docx</w:t>
+        <w:t>outputs/CPE415_Methods.docx</w:t>
       </w:r>
       <w:r>
         <w:t xml:space="preserve"> + </w:t>
@@ -1255,7 +1870,7 @@
           <w:color w:val="660099"/>
           <w:sz w:val="20"/>
         </w:rPr>
-        <w:t>CPE415_Results.docx</w:t>
+        <w:t>outputs/CPE415_Results.docx</w:t>
       </w:r>
       <w:r>
         <w:t xml:space="preserve"> for lecturer feedback.</w:t>
@@ -1299,21 +1914,41 @@
       </w:r>
     </w:p>
     <w:p>
+      <w:r>
+        <w:t>---</w:t>
+      </w:r>
+    </w:p>
+    <w:p>
       <w:pPr>
         <w:pStyle w:val="Heading2"/>
       </w:pPr>
       <w:r>
-        <w:t>Credits</w:t>
+        <w:t>🙌 Credits</w:t>
       </w:r>
     </w:p>
     <w:p>
       <w:r>
-        <w:t>CPE Group 4 — FUTA Class of 2026: Andre Clement Olanrewaju · Bodunde Boluwatife Michael · Olamiye Oluwagbeminiyi Emmanuel · Omoloju Champion Temilorun · Idoko Owoicho Louis · Ajayi David Ebenezer · Muhammed Sheriff Otaru · Yusuf Mariam Kanyinsola</w:t>
+        <w:rPr>
+          <w:b/>
+        </w:rPr>
+        <w:t>CPE Group 4 — FUTA Class of 2026</w:t>
+      </w:r>
+      <w:r>
+        <w:t xml:space="preserve"> Andre Clement Olanrewaju · Bodunde Boluwatife Michael · Olamiye Oluwagbeminiyi Emmanuel · Omoloju Champion Temilorun · Idoko Owoicho Louis · Ajayi David Ebenezer · Muhammed Sheriff Otaru · Yusuf Mariam Kanyinsola</w:t>
       </w:r>
     </w:p>
     <w:p>
       <w:r>
-        <w:t>Supervised by Engr. Charles Udekwe, Department of Electrical &amp; Electronics Engineering, FUTA.</w:t>
+        <w:t xml:space="preserve">Supervised by </w:t>
+      </w:r>
+      <w:r>
+        <w:rPr>
+          <w:b/>
+        </w:rPr>
+        <w:t>Engr. Charles Udekwe</w:t>
+      </w:r>
+      <w:r>
+        <w:t>, Department of Electrical &amp; Electronics Engineering, FUTA.</w:t>
       </w:r>
     </w:p>
     <w:sectPr>

</xml_diff>

<commit_message>
Drop submission plan section; regen docx
</commit_message>
<xml_diff>
--- a/outputs/CPE415_README.docx
+++ b/outputs/CPE415_README.docx
@@ -1813,109 +1813,7 @@
         <w:t>field_measurements.csv</w:t>
       </w:r>
       <w:r>
-        <w:t xml:space="preserve"> in ~2 seconds.</w:t>
-      </w:r>
-    </w:p>
-    <w:p>
-      <w:r>
-        <w:t>---</w:t>
-      </w:r>
-    </w:p>
-    <w:p>
-      <w:pPr>
-        <w:pStyle w:val="Heading2"/>
-      </w:pPr>
-      <w:r>
-        <w:t>📮 Submission plan</w:t>
-      </w:r>
-    </w:p>
-    <w:p>
-      <w:pPr>
-        <w:pStyle w:val="ListNumber"/>
-      </w:pPr>
-      <w:r>
-        <w:rPr>
-          <w:b/>
-        </w:rPr>
-        <w:t>Early submission (Methods + Results only):</w:t>
-      </w:r>
-      <w:r>
-        <w:t xml:space="preserve"> email </w:t>
-      </w:r>
-      <w:r>
-        <w:rPr>
-          <w:rFonts w:ascii="Consolas" w:hAnsi="Consolas"/>
-          <w:color w:val="660099"/>
-          <w:sz w:val="20"/>
-        </w:rPr>
-        <w:t>softcopyfiles001@gmail.com</w:t>
-      </w:r>
-      <w:r>
-        <w:t xml:space="preserve"> with </w:t>
-      </w:r>
-      <w:r>
-        <w:rPr>
-          <w:rFonts w:ascii="Consolas" w:hAnsi="Consolas"/>
-          <w:color w:val="660099"/>
-          <w:sz w:val="20"/>
-        </w:rPr>
-        <w:t>outputs/CPE415_Methods.docx</w:t>
-      </w:r>
-      <w:r>
-        <w:t xml:space="preserve"> + </w:t>
-      </w:r>
-      <w:r>
-        <w:rPr>
-          <w:rFonts w:ascii="Consolas" w:hAnsi="Consolas"/>
-          <w:color w:val="660099"/>
-          <w:sz w:val="20"/>
-        </w:rPr>
-        <w:t>outputs/CPE415_Results.docx</w:t>
-      </w:r>
-      <w:r>
-        <w:t xml:space="preserve"> for lecturer feedback.</w:t>
-      </w:r>
-    </w:p>
-    <w:p>
-      <w:pPr>
-        <w:pStyle w:val="ListNumber"/>
-      </w:pPr>
-      <w:r>
-        <w:rPr>
-          <w:b/>
-        </w:rPr>
-        <w:t>Apply feedback</w:t>
-      </w:r>
-      <w:r>
-        <w:t>, finish Introduction + Conclusion, merge into a single report.</w:t>
-      </w:r>
-    </w:p>
-    <w:p>
-      <w:pPr>
-        <w:pStyle w:val="ListNumber"/>
-      </w:pPr>
-      <w:r>
-        <w:rPr>
-          <w:b/>
-        </w:rPr>
-        <w:t>Final submission</w:t>
-      </w:r>
-      <w:r>
-        <w:t xml:space="preserve"> — hard copy via group rep, soft copy to the same email — </w:t>
-      </w:r>
-      <w:r>
-        <w:rPr>
-          <w:b/>
-        </w:rPr>
-        <w:t>before 24 April 2026</w:t>
-      </w:r>
-      <w:r>
-        <w:t>.</w:t>
-      </w:r>
-    </w:p>
-    <w:p>
-      <w:r>
-        <w:t>---</w:t>
+        <w:t xml:space="preserve"> in ~2 seconds. ---</w:t>
       </w:r>
     </w:p>
     <w:p>

</xml_diff>

<commit_message>
Drop 'Who does what' table
</commit_message>
<xml_diff>
--- a/outputs/CPE415_README.docx
+++ b/outputs/CPE415_README.docx
@@ -1377,394 +1377,6 @@
         <w:pStyle w:val="Heading2"/>
       </w:pPr>
       <w:r>
-        <w:t>👥 Who does what</w:t>
-      </w:r>
-    </w:p>
-    <w:tbl>
-      <w:tblPr>
-        <w:tblStyle w:val="LightGrid-Accent1"/>
-        <w:tblW w:type="auto" w:w="0"/>
-        <w:tblLook w:firstColumn="1" w:firstRow="1" w:lastColumn="0" w:lastRow="0" w:noHBand="0" w:noVBand="1" w:val="04A0"/>
-      </w:tblPr>
-      <w:tblGrid>
-        <w:gridCol w:w="3120"/>
-        <w:gridCol w:w="3120"/>
-        <w:gridCol w:w="3120"/>
-      </w:tblGrid>
-      <w:tr>
-        <w:tc>
-          <w:tcPr>
-            <w:tcW w:type="dxa" w:w="3120"/>
-          </w:tcPr>
-          <w:p>
-            <w:r/>
-            <w:r>
-              <w:rPr>
-                <w:b/>
-              </w:rPr>
-              <w:t>Section</w:t>
-            </w:r>
-          </w:p>
-        </w:tc>
-        <w:tc>
-          <w:tcPr>
-            <w:tcW w:type="dxa" w:w="3120"/>
-          </w:tcPr>
-          <w:p>
-            <w:r/>
-            <w:r>
-              <w:rPr>
-                <w:b/>
-              </w:rPr>
-              <w:t>Owner</w:t>
-            </w:r>
-          </w:p>
-        </w:tc>
-        <w:tc>
-          <w:tcPr>
-            <w:tcW w:type="dxa" w:w="3120"/>
-          </w:tcPr>
-          <w:p>
-            <w:r/>
-            <w:r>
-              <w:rPr>
-                <w:b/>
-              </w:rPr>
-              <w:t>Status</w:t>
-            </w:r>
-          </w:p>
-        </w:tc>
-      </w:tr>
-      <w:tr>
-        <w:tc>
-          <w:tcPr>
-            <w:tcW w:type="dxa" w:w="3120"/>
-          </w:tcPr>
-          <w:p>
-            <w:r/>
-            <w:r>
-              <w:t>Data digitisation &amp; CSV</w:t>
-            </w:r>
-          </w:p>
-        </w:tc>
-        <w:tc>
-          <w:tcPr>
-            <w:tcW w:type="dxa" w:w="3120"/>
-          </w:tcPr>
-          <w:p>
-            <w:r/>
-            <w:r>
-              <w:t>Lope</w:t>
-            </w:r>
-          </w:p>
-        </w:tc>
-        <w:tc>
-          <w:tcPr>
-            <w:tcW w:type="dxa" w:w="3120"/>
-          </w:tcPr>
-          <w:p>
-            <w:r/>
-            <w:r>
-              <w:t>✅ done</w:t>
-            </w:r>
-          </w:p>
-        </w:tc>
-      </w:tr>
-      <w:tr>
-        <w:tc>
-          <w:tcPr>
-            <w:tcW w:type="dxa" w:w="3120"/>
-          </w:tcPr>
-          <w:p>
-            <w:r/>
-            <w:r>
-              <w:t>Python analysis pipeline</w:t>
-            </w:r>
-          </w:p>
-        </w:tc>
-        <w:tc>
-          <w:tcPr>
-            <w:tcW w:type="dxa" w:w="3120"/>
-          </w:tcPr>
-          <w:p>
-            <w:r/>
-            <w:r>
-              <w:t>Lope</w:t>
-            </w:r>
-          </w:p>
-        </w:tc>
-        <w:tc>
-          <w:tcPr>
-            <w:tcW w:type="dxa" w:w="3120"/>
-          </w:tcPr>
-          <w:p>
-            <w:r/>
-            <w:r>
-              <w:t>✅ done</w:t>
-            </w:r>
-          </w:p>
-        </w:tc>
-      </w:tr>
-      <w:tr>
-        <w:tc>
-          <w:tcPr>
-            <w:tcW w:type="dxa" w:w="3120"/>
-          </w:tcPr>
-          <w:p>
-            <w:r/>
-            <w:r>
-              <w:rPr>
-                <w:b/>
-              </w:rPr>
-              <w:t>Methods (Section II)</w:t>
-            </w:r>
-          </w:p>
-        </w:tc>
-        <w:tc>
-          <w:tcPr>
-            <w:tcW w:type="dxa" w:w="3120"/>
-          </w:tcPr>
-          <w:p>
-            <w:r/>
-            <w:r>
-              <w:t>Lope</w:t>
-            </w:r>
-          </w:p>
-        </w:tc>
-        <w:tc>
-          <w:tcPr>
-            <w:tcW w:type="dxa" w:w="3120"/>
-          </w:tcPr>
-          <w:p>
-            <w:r/>
-            <w:r>
-              <w:t xml:space="preserve">✅ done — </w:t>
-            </w:r>
-            <w:r>
-              <w:rPr>
-                <w:rFonts w:ascii="Consolas" w:hAnsi="Consolas"/>
-                <w:color w:val="660099"/>
-                <w:sz w:val="20"/>
-              </w:rPr>
-              <w:t>METHODS.md</w:t>
-            </w:r>
-            <w:r>
-              <w:t xml:space="preserve"> + </w:t>
-            </w:r>
-            <w:r>
-              <w:rPr>
-                <w:rFonts w:ascii="Consolas" w:hAnsi="Consolas"/>
-                <w:color w:val="660099"/>
-                <w:sz w:val="20"/>
-              </w:rPr>
-              <w:t>outputs/CPE415_Methods.docx</w:t>
-            </w:r>
-          </w:p>
-        </w:tc>
-      </w:tr>
-      <w:tr>
-        <w:tc>
-          <w:tcPr>
-            <w:tcW w:type="dxa" w:w="3120"/>
-          </w:tcPr>
-          <w:p>
-            <w:r/>
-            <w:r>
-              <w:t>Results &amp; Discussion (Section V)</w:t>
-            </w:r>
-          </w:p>
-        </w:tc>
-        <w:tc>
-          <w:tcPr>
-            <w:tcW w:type="dxa" w:w="3120"/>
-          </w:tcPr>
-          <w:p>
-            <w:r/>
-            <w:r>
-              <w:t>TBD</w:t>
-            </w:r>
-          </w:p>
-        </w:tc>
-        <w:tc>
-          <w:tcPr>
-            <w:tcW w:type="dxa" w:w="3120"/>
-          </w:tcPr>
-          <w:p>
-            <w:r/>
-            <w:r>
-              <w:t xml:space="preserve">🟡 draft ready in </w:t>
-            </w:r>
-            <w:r>
-              <w:rPr>
-                <w:rFonts w:ascii="Consolas" w:hAnsi="Consolas"/>
-                <w:color w:val="660099"/>
-                <w:sz w:val="20"/>
-              </w:rPr>
-              <w:t>outputs/report.md</w:t>
-            </w:r>
-          </w:p>
-        </w:tc>
-      </w:tr>
-      <w:tr>
-        <w:tc>
-          <w:tcPr>
-            <w:tcW w:type="dxa" w:w="3120"/>
-          </w:tcPr>
-          <w:p>
-            <w:r/>
-            <w:r>
-              <w:t>Introduction + Literature (Section I)</w:t>
-            </w:r>
-          </w:p>
-        </w:tc>
-        <w:tc>
-          <w:tcPr>
-            <w:tcW w:type="dxa" w:w="3120"/>
-          </w:tcPr>
-          <w:p>
-            <w:r/>
-            <w:r>
-              <w:t>TBD</w:t>
-            </w:r>
-          </w:p>
-        </w:tc>
-        <w:tc>
-          <w:tcPr>
-            <w:tcW w:type="dxa" w:w="3120"/>
-          </w:tcPr>
-          <w:p>
-            <w:r/>
-            <w:r>
-              <w:t>⬜</w:t>
-            </w:r>
-          </w:p>
-        </w:tc>
-      </w:tr>
-      <w:tr>
-        <w:tc>
-          <w:tcPr>
-            <w:tcW w:type="dxa" w:w="3120"/>
-          </w:tcPr>
-          <w:p>
-            <w:r/>
-            <w:r>
-              <w:t>Regulatory Compliance (Section VI)</w:t>
-            </w:r>
-          </w:p>
-        </w:tc>
-        <w:tc>
-          <w:tcPr>
-            <w:tcW w:type="dxa" w:w="3120"/>
-          </w:tcPr>
-          <w:p>
-            <w:r/>
-            <w:r>
-              <w:t>TBD</w:t>
-            </w:r>
-          </w:p>
-        </w:tc>
-        <w:tc>
-          <w:tcPr>
-            <w:tcW w:type="dxa" w:w="3120"/>
-          </w:tcPr>
-          <w:p>
-            <w:r/>
-            <w:r>
-              <w:t>⬜</w:t>
-            </w:r>
-          </w:p>
-        </w:tc>
-      </w:tr>
-      <w:tr>
-        <w:tc>
-          <w:tcPr>
-            <w:tcW w:type="dxa" w:w="3120"/>
-          </w:tcPr>
-          <w:p>
-            <w:r/>
-            <w:r>
-              <w:t>Conclusion (Section VII)</w:t>
-            </w:r>
-          </w:p>
-        </w:tc>
-        <w:tc>
-          <w:tcPr>
-            <w:tcW w:type="dxa" w:w="3120"/>
-          </w:tcPr>
-          <w:p>
-            <w:r/>
-            <w:r>
-              <w:t>TBD</w:t>
-            </w:r>
-          </w:p>
-        </w:tc>
-        <w:tc>
-          <w:tcPr>
-            <w:tcW w:type="dxa" w:w="3120"/>
-          </w:tcPr>
-          <w:p>
-            <w:r/>
-            <w:r>
-              <w:t>⬜</w:t>
-            </w:r>
-          </w:p>
-        </w:tc>
-      </w:tr>
-      <w:tr>
-        <w:tc>
-          <w:tcPr>
-            <w:tcW w:type="dxa" w:w="3120"/>
-          </w:tcPr>
-          <w:p>
-            <w:r/>
-            <w:r>
-              <w:t>Formatting + references</w:t>
-            </w:r>
-          </w:p>
-        </w:tc>
-        <w:tc>
-          <w:tcPr>
-            <w:tcW w:type="dxa" w:w="3120"/>
-          </w:tcPr>
-          <w:p>
-            <w:r/>
-            <w:r>
-              <w:t>TBD</w:t>
-            </w:r>
-          </w:p>
-        </w:tc>
-        <w:tc>
-          <w:tcPr>
-            <w:tcW w:type="dxa" w:w="3120"/>
-          </w:tcPr>
-          <w:p>
-            <w:r/>
-            <w:r>
-              <w:t>⬜</w:t>
-            </w:r>
-          </w:p>
-        </w:tc>
-      </w:tr>
-    </w:tbl>
-    <w:p/>
-    <w:p>
-      <w:r>
-        <w:rPr>
-          <w:b/>
-        </w:rPr>
-        <w:t>Claim a section in the group chat and update this table when you start.</w:t>
-      </w:r>
-    </w:p>
-    <w:p>
-      <w:r>
-        <w:t>---</w:t>
-      </w:r>
-    </w:p>
-    <w:p>
-      <w:pPr>
-        <w:pStyle w:val="Heading2"/>
-      </w:pPr>
-      <w:r>
         <w:t>🔧 Reproducing the analysis locally (optional)</w:t>
       </w:r>
     </w:p>

</xml_diff>